<commit_message>
docs: expand Introduction and update project goals
</commit_message>
<xml_diff>
--- a/Атагазыева Улжан Дипломдық_Жұмыс.docx
+++ b/Атагазыева Улжан Дипломдық_Жұмыс.docx
@@ -14239,463 +14239,6 @@
         </w:rPr>
         <w:t>.</w:t>
       </w:r>
-    </w:p>
-    <w:p>
-      <w:pPr>
-        <w:widowControl/>
-        <w:autoSpaceDE/>
-        <w:autoSpaceDN/>
-        <w:ind w:firstLine="709"/>
-        <w:jc w:val="both"/>
-        <w:rPr>
-          <w:sz w:val="28"/>
-          <w:szCs w:val="28"/>
-        </w:rPr>
-      </w:pPr>
-      <w:proofErr w:type="spellStart"/>
-      <w:r>
-        <w:rPr>
-          <w:sz w:val="28"/>
-          <w:szCs w:val="28"/>
-        </w:rPr>
-        <w:t>Дипломдық</w:t>
-      </w:r>
-      <w:proofErr w:type="spellEnd"/>
-      <w:r>
-        <w:rPr>
-          <w:sz w:val="28"/>
-          <w:szCs w:val="28"/>
-        </w:rPr>
-        <w:t xml:space="preserve"> </w:t>
-      </w:r>
-      <w:proofErr w:type="spellStart"/>
-      <w:r>
-        <w:rPr>
-          <w:sz w:val="28"/>
-          <w:szCs w:val="28"/>
-        </w:rPr>
-        <w:t>жұмыс</w:t>
-      </w:r>
-      <w:proofErr w:type="spellEnd"/>
-      <w:r>
-        <w:rPr>
-          <w:sz w:val="28"/>
-          <w:szCs w:val="28"/>
-        </w:rPr>
-        <w:t xml:space="preserve"> </w:t>
-      </w:r>
-      <w:proofErr w:type="spellStart"/>
-      <w:r>
-        <w:rPr>
-          <w:sz w:val="28"/>
-          <w:szCs w:val="28"/>
-        </w:rPr>
-        <w:t>кіріспеден</w:t>
-      </w:r>
-      <w:proofErr w:type="spellEnd"/>
-      <w:r>
-        <w:rPr>
-          <w:sz w:val="28"/>
-          <w:szCs w:val="28"/>
-        </w:rPr>
-        <w:t xml:space="preserve">, </w:t>
-      </w:r>
-      <w:proofErr w:type="spellStart"/>
-      <w:r>
-        <w:rPr>
-          <w:sz w:val="28"/>
-          <w:szCs w:val="28"/>
-        </w:rPr>
-        <w:t>негізгі</w:t>
-      </w:r>
-      <w:proofErr w:type="spellEnd"/>
-      <w:r>
-        <w:rPr>
-          <w:sz w:val="28"/>
-          <w:szCs w:val="28"/>
-        </w:rPr>
-        <w:t xml:space="preserve"> </w:t>
-      </w:r>
-      <w:proofErr w:type="spellStart"/>
-      <w:r>
-        <w:rPr>
-          <w:sz w:val="28"/>
-          <w:szCs w:val="28"/>
-        </w:rPr>
-        <w:t>бөлімдерден</w:t>
-      </w:r>
-      <w:proofErr w:type="spellEnd"/>
-      <w:r>
-        <w:rPr>
-          <w:sz w:val="28"/>
-          <w:szCs w:val="28"/>
-        </w:rPr>
-        <w:t xml:space="preserve">, </w:t>
-      </w:r>
-      <w:proofErr w:type="spellStart"/>
-      <w:r>
-        <w:rPr>
-          <w:sz w:val="28"/>
-          <w:szCs w:val="28"/>
-        </w:rPr>
-        <w:t>қорытындыдан</w:t>
-      </w:r>
-      <w:proofErr w:type="spellEnd"/>
-      <w:r>
-        <w:rPr>
-          <w:sz w:val="28"/>
-          <w:szCs w:val="28"/>
-        </w:rPr>
-        <w:t xml:space="preserve"> </w:t>
-      </w:r>
-      <w:proofErr w:type="spellStart"/>
-      <w:r>
-        <w:rPr>
-          <w:sz w:val="28"/>
-          <w:szCs w:val="28"/>
-        </w:rPr>
-        <w:t>және</w:t>
-      </w:r>
-      <w:proofErr w:type="spellEnd"/>
-      <w:r>
-        <w:rPr>
-          <w:sz w:val="28"/>
-          <w:szCs w:val="28"/>
-        </w:rPr>
-        <w:t xml:space="preserve"> </w:t>
-      </w:r>
-      <w:proofErr w:type="spellStart"/>
-      <w:r>
-        <w:rPr>
-          <w:sz w:val="28"/>
-          <w:szCs w:val="28"/>
-        </w:rPr>
-        <w:t>пайдаланылған</w:t>
-      </w:r>
-      <w:proofErr w:type="spellEnd"/>
-      <w:r>
-        <w:rPr>
-          <w:sz w:val="28"/>
-          <w:szCs w:val="28"/>
-        </w:rPr>
-        <w:t xml:space="preserve"> </w:t>
-      </w:r>
-      <w:proofErr w:type="spellStart"/>
-      <w:r>
-        <w:rPr>
-          <w:sz w:val="28"/>
-          <w:szCs w:val="28"/>
-        </w:rPr>
-        <w:t>әдебиеттер</w:t>
-      </w:r>
-      <w:proofErr w:type="spellEnd"/>
-      <w:r>
-        <w:rPr>
-          <w:sz w:val="28"/>
-          <w:szCs w:val="28"/>
-        </w:rPr>
-        <w:t xml:space="preserve"> </w:t>
-      </w:r>
-      <w:proofErr w:type="spellStart"/>
-      <w:r>
-        <w:rPr>
-          <w:sz w:val="28"/>
-          <w:szCs w:val="28"/>
-        </w:rPr>
-        <w:t>тізімінен</w:t>
-      </w:r>
-      <w:proofErr w:type="spellEnd"/>
-      <w:r>
-        <w:rPr>
-          <w:sz w:val="28"/>
-          <w:szCs w:val="28"/>
-        </w:rPr>
-        <w:t xml:space="preserve"> </w:t>
-      </w:r>
-      <w:proofErr w:type="spellStart"/>
-      <w:r>
-        <w:rPr>
-          <w:sz w:val="28"/>
-          <w:szCs w:val="28"/>
-        </w:rPr>
-        <w:t>тұрады</w:t>
-      </w:r>
-      <w:proofErr w:type="spellEnd"/>
-      <w:r>
-        <w:rPr>
-          <w:sz w:val="28"/>
-          <w:szCs w:val="28"/>
-        </w:rPr>
-        <w:t xml:space="preserve">. </w:t>
-      </w:r>
-      <w:proofErr w:type="spellStart"/>
-      <w:r>
-        <w:rPr>
-          <w:sz w:val="28"/>
-          <w:szCs w:val="28"/>
-        </w:rPr>
-        <w:t>Негізгі</w:t>
-      </w:r>
-      <w:proofErr w:type="spellEnd"/>
-      <w:r>
-        <w:rPr>
-          <w:sz w:val="28"/>
-          <w:szCs w:val="28"/>
-        </w:rPr>
-        <w:t xml:space="preserve"> </w:t>
-      </w:r>
-      <w:proofErr w:type="spellStart"/>
-      <w:r>
-        <w:rPr>
-          <w:sz w:val="28"/>
-          <w:szCs w:val="28"/>
-        </w:rPr>
-        <w:t>бөлімде</w:t>
-      </w:r>
-      <w:proofErr w:type="spellEnd"/>
-      <w:r>
-        <w:rPr>
-          <w:sz w:val="28"/>
-          <w:szCs w:val="28"/>
-        </w:rPr>
-        <w:t xml:space="preserve"> бизнес-</w:t>
-      </w:r>
-      <w:proofErr w:type="spellStart"/>
-      <w:r>
-        <w:rPr>
-          <w:sz w:val="28"/>
-          <w:szCs w:val="28"/>
-        </w:rPr>
-        <w:t>процестерді</w:t>
-      </w:r>
-      <w:proofErr w:type="spellEnd"/>
-      <w:r>
-        <w:rPr>
-          <w:sz w:val="28"/>
-          <w:szCs w:val="28"/>
-        </w:rPr>
-        <w:t xml:space="preserve"> </w:t>
-      </w:r>
-      <w:proofErr w:type="spellStart"/>
-      <w:r>
-        <w:rPr>
-          <w:sz w:val="28"/>
-          <w:szCs w:val="28"/>
-        </w:rPr>
-        <w:t>басқарудың</w:t>
-      </w:r>
-      <w:proofErr w:type="spellEnd"/>
-      <w:r>
-        <w:rPr>
-          <w:sz w:val="28"/>
-          <w:szCs w:val="28"/>
-        </w:rPr>
-        <w:t xml:space="preserve"> </w:t>
-      </w:r>
-      <w:proofErr w:type="spellStart"/>
-      <w:r>
-        <w:rPr>
-          <w:sz w:val="28"/>
-          <w:szCs w:val="28"/>
-        </w:rPr>
-        <w:t>теориялық</w:t>
-      </w:r>
-      <w:proofErr w:type="spellEnd"/>
-      <w:r>
-        <w:rPr>
-          <w:sz w:val="28"/>
-          <w:szCs w:val="28"/>
-        </w:rPr>
-        <w:t xml:space="preserve"> </w:t>
-      </w:r>
-      <w:proofErr w:type="spellStart"/>
-      <w:r>
-        <w:rPr>
-          <w:sz w:val="28"/>
-          <w:szCs w:val="28"/>
-        </w:rPr>
-        <w:t>аспектілері</w:t>
-      </w:r>
-      <w:proofErr w:type="spellEnd"/>
-      <w:r>
-        <w:rPr>
-          <w:sz w:val="28"/>
-          <w:szCs w:val="28"/>
-        </w:rPr>
-        <w:t>, 1</w:t>
-      </w:r>
-      <w:proofErr w:type="gramStart"/>
-      <w:r>
-        <w:rPr>
-          <w:sz w:val="28"/>
-          <w:szCs w:val="28"/>
-        </w:rPr>
-        <w:t>С:Документооборот</w:t>
-      </w:r>
-      <w:proofErr w:type="gramEnd"/>
-      <w:r>
-        <w:rPr>
-          <w:sz w:val="28"/>
-          <w:szCs w:val="28"/>
-        </w:rPr>
-        <w:t xml:space="preserve"> </w:t>
-      </w:r>
-      <w:proofErr w:type="spellStart"/>
-      <w:r>
-        <w:rPr>
-          <w:sz w:val="28"/>
-          <w:szCs w:val="28"/>
-        </w:rPr>
-        <w:t>жүйесінің</w:t>
-      </w:r>
-      <w:proofErr w:type="spellEnd"/>
-      <w:r>
-        <w:rPr>
-          <w:sz w:val="28"/>
-          <w:szCs w:val="28"/>
-        </w:rPr>
-        <w:t xml:space="preserve"> </w:t>
-      </w:r>
-      <w:proofErr w:type="spellStart"/>
-      <w:r>
-        <w:rPr>
-          <w:sz w:val="28"/>
-          <w:szCs w:val="28"/>
-        </w:rPr>
-        <w:t>талдауы</w:t>
-      </w:r>
-      <w:proofErr w:type="spellEnd"/>
-      <w:r>
-        <w:rPr>
-          <w:sz w:val="28"/>
-          <w:szCs w:val="28"/>
-        </w:rPr>
-        <w:t xml:space="preserve">, KPI </w:t>
-      </w:r>
-      <w:proofErr w:type="spellStart"/>
-      <w:r>
-        <w:rPr>
-          <w:sz w:val="28"/>
-          <w:szCs w:val="28"/>
-        </w:rPr>
-        <w:t>модулінің</w:t>
-      </w:r>
-      <w:proofErr w:type="spellEnd"/>
-      <w:r>
-        <w:rPr>
-          <w:sz w:val="28"/>
-          <w:szCs w:val="28"/>
-        </w:rPr>
-        <w:t xml:space="preserve"> </w:t>
-      </w:r>
-      <w:proofErr w:type="spellStart"/>
-      <w:r>
-        <w:rPr>
-          <w:sz w:val="28"/>
-          <w:szCs w:val="28"/>
-        </w:rPr>
-        <w:t>жобалануы</w:t>
-      </w:r>
-      <w:proofErr w:type="spellEnd"/>
-      <w:r>
-        <w:rPr>
-          <w:sz w:val="28"/>
-          <w:szCs w:val="28"/>
-        </w:rPr>
-        <w:t xml:space="preserve"> </w:t>
-      </w:r>
-      <w:proofErr w:type="spellStart"/>
-      <w:r>
-        <w:rPr>
-          <w:sz w:val="28"/>
-          <w:szCs w:val="28"/>
-        </w:rPr>
-        <w:t>және</w:t>
-      </w:r>
-      <w:proofErr w:type="spellEnd"/>
-      <w:r>
-        <w:rPr>
-          <w:sz w:val="28"/>
-          <w:szCs w:val="28"/>
-        </w:rPr>
-        <w:t xml:space="preserve"> </w:t>
-      </w:r>
-      <w:proofErr w:type="spellStart"/>
-      <w:r>
-        <w:rPr>
-          <w:sz w:val="28"/>
-          <w:szCs w:val="28"/>
-        </w:rPr>
-        <w:t>бағдарламалық</w:t>
-      </w:r>
-      <w:proofErr w:type="spellEnd"/>
-      <w:r>
-        <w:rPr>
-          <w:sz w:val="28"/>
-          <w:szCs w:val="28"/>
-        </w:rPr>
-        <w:t xml:space="preserve"> </w:t>
-      </w:r>
-      <w:proofErr w:type="spellStart"/>
-      <w:r>
-        <w:rPr>
-          <w:sz w:val="28"/>
-          <w:szCs w:val="28"/>
-        </w:rPr>
-        <w:t>жүзеге</w:t>
-      </w:r>
-      <w:proofErr w:type="spellEnd"/>
-      <w:r>
-        <w:rPr>
-          <w:sz w:val="28"/>
-          <w:szCs w:val="28"/>
-        </w:rPr>
-        <w:t xml:space="preserve"> </w:t>
-      </w:r>
-      <w:proofErr w:type="spellStart"/>
-      <w:r>
-        <w:rPr>
-          <w:sz w:val="28"/>
-          <w:szCs w:val="28"/>
-        </w:rPr>
-        <w:t>асырылуы</w:t>
-      </w:r>
-      <w:proofErr w:type="spellEnd"/>
-      <w:r>
-        <w:rPr>
-          <w:sz w:val="28"/>
-          <w:szCs w:val="28"/>
-        </w:rPr>
-        <w:t xml:space="preserve"> </w:t>
-      </w:r>
-      <w:proofErr w:type="spellStart"/>
-      <w:r>
-        <w:rPr>
-          <w:sz w:val="28"/>
-          <w:szCs w:val="28"/>
-        </w:rPr>
-        <w:t>қарастырылады</w:t>
-      </w:r>
-      <w:proofErr w:type="spellEnd"/>
-      <w:r>
-        <w:rPr>
-          <w:sz w:val="28"/>
-          <w:szCs w:val="28"/>
-        </w:rPr>
-        <w:t>.</w:t>
-      </w:r>
-    </w:p>
-    <w:p>
-      <w:pPr>
-        <w:widowControl/>
-        <w:autoSpaceDE/>
-        <w:autoSpaceDN/>
-        <w:spacing w:after="160" w:line="278" w:lineRule="auto"/>
-        <w:rPr>
-          <w:sz w:val="28"/>
-          <w:szCs w:val="28"/>
-        </w:rPr>
-      </w:pPr>
       <w:r>
         <w:rPr>
           <w:sz w:val="28"/>
@@ -35974,6 +35517,7 @@
         <w:docPartUnique/>
       </w:docPartObj>
     </w:sdtPr>
+    <w:sdtEndPr/>
     <w:sdtContent>
       <w:p>
         <w:pPr>

</xml_diff>

<commit_message>
simplify complex sentences and improve clarity
</commit_message>
<xml_diff>
--- a/Атагазыева Улжан Дипломдық_Жұмыс.docx
+++ b/Атагазыева Улжан Дипломдық_Жұмыс.docx
@@ -19493,6 +19493,7 @@
           <w:lang w:val="kk-KZ"/>
         </w:rPr>
         <w:br/>
+        <w:t>- процестердің орындалуын жеделдету;</w:t>
       </w:r>
       <w:r>
         <w:rPr>
@@ -19500,7 +19501,7 @@
           <w:szCs w:val="28"/>
           <w:lang w:val="kk-KZ"/>
         </w:rPr>
-        <w:t>-</w:t>
+        <w:br/>
       </w:r>
       <w:r>
         <w:rPr>
@@ -19508,7 +19509,8 @@
           <w:szCs w:val="28"/>
           <w:lang w:val="kk-KZ"/>
         </w:rPr>
-        <w:t xml:space="preserve"> процестердің орындалуын жеделдету;</w:t>
+        <w:lastRenderedPageBreak/>
+        <w:t>- адами фактор әсерін азайту;</w:t>
       </w:r>
       <w:r>
         <w:rPr>
@@ -19517,6 +19519,7 @@
           <w:lang w:val="kk-KZ"/>
         </w:rPr>
         <w:br/>
+        <w:t>- ақпараттың дәлдігі мен толықтығын қамтамасыз ету;</w:t>
       </w:r>
       <w:r>
         <w:rPr>
@@ -19524,8 +19527,8 @@
           <w:szCs w:val="28"/>
           <w:lang w:val="kk-KZ"/>
         </w:rPr>
-        <w:lastRenderedPageBreak/>
-        <w:t>-</w:t>
+        <w:br/>
+        <w:t>- басқарушылық бақылауды күшейту;</w:t>
       </w:r>
       <w:r>
         <w:rPr>
@@ -19533,79 +19536,8 @@
           <w:szCs w:val="28"/>
           <w:lang w:val="kk-KZ"/>
         </w:rPr>
-        <w:t xml:space="preserve"> адами фактор әсерін азайту;</w:t>
-      </w:r>
-      <w:r>
-        <w:rPr>
-          <w:sz w:val="28"/>
-          <w:szCs w:val="28"/>
-          <w:lang w:val="kk-KZ"/>
-        </w:rPr>
         <w:br/>
-      </w:r>
-      <w:r>
-        <w:rPr>
-          <w:sz w:val="28"/>
-          <w:szCs w:val="28"/>
-          <w:lang w:val="kk-KZ"/>
-        </w:rPr>
-        <w:t>-</w:t>
-      </w:r>
-      <w:r>
-        <w:rPr>
-          <w:sz w:val="28"/>
-          <w:szCs w:val="28"/>
-          <w:lang w:val="kk-KZ"/>
-        </w:rPr>
-        <w:t xml:space="preserve"> ақпараттың дәлдігі мен толықтығын қамтамасыз ету;</w:t>
-      </w:r>
-      <w:r>
-        <w:rPr>
-          <w:sz w:val="28"/>
-          <w:szCs w:val="28"/>
-          <w:lang w:val="kk-KZ"/>
-        </w:rPr>
-        <w:br/>
-      </w:r>
-      <w:r>
-        <w:rPr>
-          <w:sz w:val="28"/>
-          <w:szCs w:val="28"/>
-          <w:lang w:val="kk-KZ"/>
-        </w:rPr>
-        <w:t>-</w:t>
-      </w:r>
-      <w:r>
-        <w:rPr>
-          <w:sz w:val="28"/>
-          <w:szCs w:val="28"/>
-          <w:lang w:val="kk-KZ"/>
-        </w:rPr>
-        <w:t xml:space="preserve"> басқарушылық бақылауды күшейту;</w:t>
-      </w:r>
-      <w:r>
-        <w:rPr>
-          <w:sz w:val="28"/>
-          <w:szCs w:val="28"/>
-          <w:lang w:val="kk-KZ"/>
-        </w:rPr>
-        <w:br/>
-      </w:r>
-      <w:r>
-        <w:rPr>
-          <w:sz w:val="28"/>
-          <w:szCs w:val="28"/>
-          <w:lang w:val="kk-KZ"/>
-        </w:rPr>
-        <w:t>-</w:t>
-      </w:r>
-      <w:r>
-        <w:rPr>
-          <w:sz w:val="28"/>
-          <w:szCs w:val="28"/>
-          <w:lang w:val="kk-KZ"/>
-        </w:rPr>
-        <w:t xml:space="preserve"> ресурстарды тиімді пайдалану.</w:t>
+        <w:t>- ресурстарды тиімді пайдалану.</w:t>
       </w:r>
     </w:p>
     <w:p>
@@ -25380,6 +25312,78 @@
       <w:r>
         <w:t xml:space="preserve"> </w:t>
       </w:r>
+    </w:p>
+    <w:p>
+      <w:pPr>
+        <w:widowControl/>
+        <w:autoSpaceDE/>
+        <w:autoSpaceDN/>
+        <w:ind w:firstLine="709"/>
+        <w:jc w:val="both"/>
+        <w:rPr>
+          <w:sz w:val="28"/>
+          <w:szCs w:val="28"/>
+          <w:lang w:val="kk-KZ"/>
+        </w:rPr>
+      </w:pPr>
+      <w:r>
+        <w:rPr>
+          <w:sz w:val="28"/>
+          <w:szCs w:val="28"/>
+          <w:lang w:val="kk-KZ"/>
+        </w:rPr>
+        <w:t>Қазіргі заманғы кәсіпорындарды басқару жүйесінде тиімділікті бағалау ерекше маңызға ие. Бизнес-процестерді автоматтандыру тек олардың орындалуын бақылаумен шектелмей, сонымен қатар олардың нәтижелілігін сандық көрсеткіштер арқылы талдауды талап етеді. Осы тұрғыда KPI (Key Performance Indicators – негізгі нәтижелілік көрсеткіштері) жүйесі ұйым қызметін басқарудың маңызды құралдарының бірі болып табылады.</w:t>
+      </w:r>
+    </w:p>
+    <w:p>
+      <w:pPr>
+        <w:widowControl/>
+        <w:autoSpaceDE/>
+        <w:autoSpaceDN/>
+        <w:ind w:firstLine="709"/>
+        <w:jc w:val="both"/>
+        <w:rPr>
+          <w:sz w:val="28"/>
+          <w:szCs w:val="28"/>
+          <w:lang w:val="kk-KZ"/>
+        </w:rPr>
+      </w:pPr>
+      <w:r>
+        <w:rPr>
+          <w:sz w:val="28"/>
+          <w:szCs w:val="28"/>
+          <w:lang w:val="kk-KZ"/>
+        </w:rPr>
+        <w:t xml:space="preserve">KPI – бұл кәсіпорынның стратегиялық және операциялық мақсаттарына қол жеткізу деңгейін сипаттайтын өлшенетін көрсеткіштер жиынтығы. KPI көрсеткіштері ұйымның тиімділігін бағалауға, қызметкерлердің жұмыс нәтижесін талдауға және басқарушылық шешімдерді деректерге негіздей отырып қабылдауға мүмкіндік береді. KPI жүйесін енгізу кәсіпорын қызметін </w:t>
+      </w:r>
+      <w:r>
+        <w:rPr>
+          <w:sz w:val="28"/>
+          <w:szCs w:val="28"/>
+          <w:lang w:val="kk-KZ"/>
+        </w:rPr>
+        <w:lastRenderedPageBreak/>
+        <w:t>сапалы жаңа деңгейге көтереді, себебі ол басқарудың объективтілігін қамтамасыз етеді.</w:t>
+      </w:r>
+    </w:p>
+    <w:p>
+      <w:pPr>
+        <w:widowControl/>
+        <w:autoSpaceDE/>
+        <w:autoSpaceDN/>
+        <w:ind w:firstLine="709"/>
+        <w:jc w:val="both"/>
+        <w:rPr>
+          <w:sz w:val="28"/>
+          <w:szCs w:val="28"/>
+          <w:lang w:val="kk-KZ"/>
+        </w:rPr>
+      </w:pPr>
+    </w:p>
+    <w:p>
+      <w:pPr>
+        <w:pStyle w:val="14"/>
+      </w:pPr>
     </w:p>
     <w:p>
       <w:pPr>
@@ -40165,6 +40169,7 @@
         <w:docPartUnique/>
       </w:docPartObj>
     </w:sdtPr>
+    <w:sdtEndPr/>
     <w:sdtContent>
       <w:p>
         <w:pPr>
@@ -43875,7 +43880,7 @@
   <w:style w:type="paragraph" w:default="1" w:styleId="a">
     <w:name w:val="Normal"/>
     <w:qFormat/>
-    <w:rsid w:val="002C5B3A"/>
+    <w:rsid w:val="005D4C14"/>
     <w:pPr>
       <w:widowControl w:val="0"/>
       <w:autoSpaceDE w:val="0"/>

</xml_diff>

<commit_message>
enhance KPI module calculation logic
Improved description of KPI calculation logic 
and clarified performance evaluation methods.
</commit_message>
<xml_diff>
--- a/Атагазыева Улжан Дипломдық_Жұмыс.docx
+++ b/Атагазыева Улжан Дипломдық_Жұмыс.docx
@@ -25365,6 +25365,86 @@
         <w:lastRenderedPageBreak/>
         <w:t>сапалы жаңа деңгейге көтереді, себебі ол басқарудың объективтілігін қамтамасыз етеді.</w:t>
       </w:r>
+    </w:p>
+    <w:p>
+      <w:pPr>
+        <w:widowControl/>
+        <w:autoSpaceDE/>
+        <w:autoSpaceDN/>
+        <w:ind w:firstLine="709"/>
+        <w:jc w:val="both"/>
+        <w:rPr>
+          <w:sz w:val="28"/>
+          <w:szCs w:val="28"/>
+          <w:lang w:val="kk-KZ"/>
+        </w:rPr>
+      </w:pPr>
+      <w:r>
+        <w:rPr>
+          <w:sz w:val="28"/>
+          <w:szCs w:val="28"/>
+          <w:lang w:val="kk-KZ"/>
+        </w:rPr>
+        <w:t>Бизнес-процестердің тиімділігін бағалау барысында KPI көрсеткіштері бірнеше негізгі бағыт бойынша қарастырылады. Біріншіден, уақыт көрсеткіштері маңызды рөл атқарады. Бұл көрсеткіштер тапсырмалардың орындалу жылдамдығын және мерзімдердің сақталу деңгейін анықтайды. Мысалы, тапсырманың жоспарланған уақытпен салыстырғандағы нақты орындалу уақыты процестің тиімділігін бағалаудың негізгі критерийлерінің бірі болып табылады.</w:t>
+      </w:r>
+    </w:p>
+    <w:p>
+      <w:pPr>
+        <w:widowControl/>
+        <w:autoSpaceDE/>
+        <w:autoSpaceDN/>
+        <w:ind w:firstLine="709"/>
+        <w:jc w:val="both"/>
+        <w:rPr>
+          <w:sz w:val="28"/>
+          <w:szCs w:val="28"/>
+          <w:lang w:val="kk-KZ"/>
+        </w:rPr>
+      </w:pPr>
+      <w:r>
+        <w:rPr>
+          <w:sz w:val="28"/>
+          <w:szCs w:val="28"/>
+          <w:lang w:val="kk-KZ"/>
+        </w:rPr>
+        <w:t>Екіншіден, сапа көрсеткіштері қарастырылады. Бұл көрсеткіштер тапсырмалардың дұрыс орындалу деңгейін, қателіктердің санын және қайта өңдеу қажеттілігін сипаттайды. Сапа көрсеткіштері қызметкерлердің кәсіби деңгейін бағалауға мүмкіндік береді және процестердің сенімділігін анықтайды.</w:t>
+      </w:r>
+    </w:p>
+    <w:p>
+      <w:pPr>
+        <w:widowControl/>
+        <w:autoSpaceDE/>
+        <w:autoSpaceDN/>
+        <w:ind w:firstLine="709"/>
+        <w:jc w:val="both"/>
+        <w:rPr>
+          <w:sz w:val="28"/>
+          <w:szCs w:val="28"/>
+          <w:lang w:val="kk-KZ"/>
+        </w:rPr>
+      </w:pPr>
+      <w:r>
+        <w:rPr>
+          <w:sz w:val="28"/>
+          <w:szCs w:val="28"/>
+          <w:lang w:val="kk-KZ"/>
+        </w:rPr>
+        <w:t>Үшіншіден, өнімділік көрсеткіштері маңызды орын алады. Олар белгілі бір уақыт аралығында орындалған тапсырмалар санын сипаттайды. Өнімділік көрсеткіштері қызметкерлердің жұмыс жүктемесін және олардың тиімділігін бағалауға мүмкіндік береді.</w:t>
+      </w:r>
+    </w:p>
+    <w:p>
+      <w:pPr>
+        <w:widowControl/>
+        <w:autoSpaceDE/>
+        <w:autoSpaceDN/>
+        <w:ind w:firstLine="709"/>
+        <w:jc w:val="both"/>
+        <w:rPr>
+          <w:sz w:val="28"/>
+          <w:szCs w:val="28"/>
+          <w:lang w:val="kk-KZ"/>
+        </w:rPr>
+      </w:pPr>
     </w:p>
     <w:p>
       <w:pPr>

</xml_diff>

<commit_message>
expand KPI module section
Added detailed explanation of algorithms 
and extended KPI-related content.
</commit_message>
<xml_diff>
--- a/Атагазыева Улжан Дипломдық_Жұмыс.docx
+++ b/Атагазыева Улжан Дипломдық_Жұмыс.docx
@@ -4638,7 +4638,6 @@
         </w:rPr>
         <w:tab/>
       </w:r>
-      <w:proofErr w:type="gramStart"/>
       <w:r>
         <w:rPr>
           <w:i/>
@@ -4663,7 +4662,6 @@
         <w:t>жылғы</w:t>
       </w:r>
       <w:proofErr w:type="spellEnd"/>
-      <w:proofErr w:type="gramEnd"/>
       <w:r>
         <w:rPr>
           <w:i/>
@@ -4881,7 +4879,6 @@
         </w:rPr>
         <w:t xml:space="preserve">: </w:t>
       </w:r>
-      <w:proofErr w:type="gramStart"/>
       <w:r>
         <w:rPr>
           <w:i/>
@@ -4905,7 +4902,6 @@
         </w:rPr>
         <w:t>_</w:t>
       </w:r>
-      <w:proofErr w:type="gramEnd"/>
       <w:r>
         <w:rPr>
           <w:i/>
@@ -4932,7 +4928,6 @@
         </w:rPr>
         <w:tab/>
       </w:r>
-      <w:proofErr w:type="gramStart"/>
       <w:r>
         <w:rPr>
           <w:i/>
@@ -4956,7 +4951,6 @@
         </w:rPr>
         <w:t>ж.</w:t>
       </w:r>
-      <w:proofErr w:type="gramEnd"/>
     </w:p>
     <w:p>
       <w:pPr>
@@ -8363,23 +8357,7 @@
           <w:sz w:val="28"/>
           <w:szCs w:val="28"/>
         </w:rPr>
-        <w:t>, 1</w:t>
-      </w:r>
-      <w:proofErr w:type="gramStart"/>
-      <w:r>
-        <w:rPr>
-          <w:sz w:val="28"/>
-          <w:szCs w:val="28"/>
-        </w:rPr>
-        <w:t>С:Документооборот</w:t>
-      </w:r>
-      <w:proofErr w:type="gramEnd"/>
-      <w:r>
-        <w:rPr>
-          <w:sz w:val="28"/>
-          <w:szCs w:val="28"/>
-        </w:rPr>
-        <w:t xml:space="preserve">, KPI, </w:t>
+        <w:t xml:space="preserve">, 1С:Документооборот, KPI, </w:t>
       </w:r>
       <w:proofErr w:type="spellStart"/>
       <w:r>
@@ -8398,7 +8376,6 @@
         <w:t xml:space="preserve"> </w:t>
       </w:r>
       <w:proofErr w:type="spellStart"/>
-      <w:proofErr w:type="gramStart"/>
       <w:r>
         <w:rPr>
           <w:sz w:val="28"/>
@@ -8421,7 +8398,6 @@
         </w:rPr>
         <w:t>.</w:t>
       </w:r>
-      <w:proofErr w:type="gramEnd"/>
     </w:p>
     <w:p>
       <w:pPr>
@@ -8487,23 +8463,7 @@
           <w:sz w:val="28"/>
           <w:szCs w:val="28"/>
         </w:rPr>
-        <w:t>В данной дипломной работе рассматривается разработка и совершенствование информационной системы управления бизнес-процессами предприятия на базе конфигурации 1</w:t>
-      </w:r>
-      <w:proofErr w:type="gramStart"/>
-      <w:r>
-        <w:rPr>
-          <w:sz w:val="28"/>
-          <w:szCs w:val="28"/>
-        </w:rPr>
-        <w:t>С:Документооборот</w:t>
-      </w:r>
-      <w:proofErr w:type="gramEnd"/>
-      <w:r>
-        <w:rPr>
-          <w:sz w:val="28"/>
-          <w:szCs w:val="28"/>
-        </w:rPr>
-        <w:t>. В рамках исследования проанализированы функциональные возможности конфигурации, и предложен модуль для расчета и анализа KPI с целью оценки эффективности выполнения бизнес-процессов. Работа охватывает теоретические основы управления бизнес-процессами, методы оценки эффективности и этапы проектирования информационной системы. Практическая значимость заключается в повышении прозрачности управления, оптимизации документооборота и улучшении оценки результатов работы сотрудников.</w:t>
+        <w:t>В данной дипломной работе рассматривается разработка и совершенствование информационной системы управления бизнес-процессами предприятия на базе конфигурации 1С:Документооборот. В рамках исследования проанализированы функциональные возможности конфигурации, и предложен модуль для расчета и анализа KPI с целью оценки эффективности выполнения бизнес-процессов. Работа охватывает теоретические основы управления бизнес-процессами, методы оценки эффективности и этапы проектирования информационной системы. Практическая значимость заключается в повышении прозрачности управления, оптимизации документооборота и улучшении оценки результатов работы сотрудников.</w:t>
       </w:r>
     </w:p>
     <w:p>
@@ -8527,23 +8487,7 @@
           <w:sz w:val="28"/>
           <w:szCs w:val="28"/>
         </w:rPr>
-        <w:t>Ключевые слова: бизнес-процесс, автоматизация, 1</w:t>
-      </w:r>
-      <w:proofErr w:type="gramStart"/>
-      <w:r>
-        <w:rPr>
-          <w:sz w:val="28"/>
-          <w:szCs w:val="28"/>
-        </w:rPr>
-        <w:t>С:Документооборот</w:t>
-      </w:r>
-      <w:proofErr w:type="gramEnd"/>
-      <w:r>
-        <w:rPr>
-          <w:sz w:val="28"/>
-          <w:szCs w:val="28"/>
-        </w:rPr>
-        <w:t>, KPI, информационная система</w:t>
+        <w:t>Ключевые слова: бизнес-процесс, автоматизация, 1С:Документооборот, KPI, информационная система</w:t>
       </w:r>
       <w:r>
         <w:rPr>
@@ -8621,25 +8565,7 @@
           <w:szCs w:val="28"/>
           <w:lang w:val="en-US"/>
         </w:rPr>
-        <w:t>This diploma thesis examines the development and improvement of an information system for managing enterprise business processes based on the 1</w:t>
-      </w:r>
-      <w:proofErr w:type="gramStart"/>
-      <w:r>
-        <w:rPr>
-          <w:sz w:val="28"/>
-          <w:szCs w:val="28"/>
-          <w:lang w:val="en-US"/>
-        </w:rPr>
-        <w:t>C:Document</w:t>
-      </w:r>
-      <w:proofErr w:type="gramEnd"/>
-      <w:r>
-        <w:rPr>
-          <w:sz w:val="28"/>
-          <w:szCs w:val="28"/>
-          <w:lang w:val="en-US"/>
-        </w:rPr>
-        <w:t xml:space="preserve"> Management configuration. The study analyzes the functional capabilities of the configuration and proposes a KPI calculation and analysis module to evaluate the efficiency of business process execution. The thesis covers theoretical foundations of business process management, methods for assessing efficiency, and stages of information system design. The practical significance of the work lies in increasing management transparency, optimizing document workflow, and enhancing employee performance evaluation.</w:t>
+        <w:t>This diploma thesis examines the development and improvement of an information system for managing enterprise business processes based on the 1C:Document Management configuration. The study analyzes the functional capabilities of the configuration and proposes a KPI calculation and analysis module to evaluate the efficiency of business process execution. The thesis covers theoretical foundations of business process management, methods for assessing efficiency, and stages of information system design. The practical significance of the work lies in increasing management transparency, optimizing document workflow, and enhancing employee performance evaluation.</w:t>
       </w:r>
     </w:p>
     <w:p>
@@ -8665,25 +8591,7 @@
           <w:szCs w:val="28"/>
           <w:lang w:val="en-US"/>
         </w:rPr>
-        <w:t>Keywords: business process, automation, 1</w:t>
-      </w:r>
-      <w:proofErr w:type="gramStart"/>
-      <w:r>
-        <w:rPr>
-          <w:sz w:val="28"/>
-          <w:szCs w:val="28"/>
-          <w:lang w:val="en-US"/>
-        </w:rPr>
-        <w:t>C:Document</w:t>
-      </w:r>
-      <w:proofErr w:type="gramEnd"/>
-      <w:r>
-        <w:rPr>
-          <w:sz w:val="28"/>
-          <w:szCs w:val="28"/>
-          <w:lang w:val="en-US"/>
-        </w:rPr>
-        <w:t xml:space="preserve"> Management, KPI, information system</w:t>
+        <w:t>Keywords: business process, automation, 1C:Document Management, KPI, information system</w:t>
       </w:r>
       <w:r>
         <w:rPr>
@@ -10970,23 +10878,7 @@
           <w:szCs w:val="28"/>
         </w:rPr>
         <w:lastRenderedPageBreak/>
-        <w:t>1</w:t>
-      </w:r>
-      <w:proofErr w:type="gramStart"/>
-      <w:r>
-        <w:rPr>
-          <w:sz w:val="28"/>
-          <w:szCs w:val="28"/>
-        </w:rPr>
-        <w:t>С:Документооборот</w:t>
-      </w:r>
-      <w:proofErr w:type="gramEnd"/>
-      <w:r>
-        <w:rPr>
-          <w:sz w:val="28"/>
-          <w:szCs w:val="28"/>
-        </w:rPr>
-        <w:t xml:space="preserve"> </w:t>
+        <w:t xml:space="preserve">1С:Документооборот </w:t>
       </w:r>
       <w:proofErr w:type="spellStart"/>
       <w:r>
@@ -11813,23 +11705,7 @@
           <w:sz w:val="28"/>
           <w:szCs w:val="28"/>
         </w:rPr>
-        <w:t xml:space="preserve"> – 1</w:t>
-      </w:r>
-      <w:proofErr w:type="gramStart"/>
-      <w:r>
-        <w:rPr>
-          <w:sz w:val="28"/>
-          <w:szCs w:val="28"/>
-        </w:rPr>
-        <w:t>С:Документооборот</w:t>
-      </w:r>
-      <w:proofErr w:type="gramEnd"/>
-      <w:r>
-        <w:rPr>
-          <w:sz w:val="28"/>
-          <w:szCs w:val="28"/>
-        </w:rPr>
-        <w:t xml:space="preserve"> </w:t>
+        <w:t xml:space="preserve"> – 1С:Документооборот </w:t>
       </w:r>
       <w:proofErr w:type="spellStart"/>
       <w:r>
@@ -19651,19 +19527,8 @@
           <w:sz w:val="28"/>
           <w:szCs w:val="28"/>
         </w:rPr>
-        <w:t>1</w:t>
-      </w:r>
-      <w:proofErr w:type="gramStart"/>
-      <w:r>
-        <w:rPr>
-          <w:b/>
-          <w:bCs/>
-          <w:sz w:val="28"/>
-          <w:szCs w:val="28"/>
-        </w:rPr>
-        <w:t>С:Документооборот</w:t>
-      </w:r>
-      <w:proofErr w:type="gramEnd"/>
+        <w:t>1С:Документооборот</w:t>
+      </w:r>
       <w:r>
         <w:rPr>
           <w:sz w:val="28"/>
@@ -20105,23 +19970,7 @@
           <w:sz w:val="28"/>
           <w:szCs w:val="28"/>
         </w:rPr>
-        <w:t>1</w:t>
-      </w:r>
-      <w:proofErr w:type="gramStart"/>
-      <w:r>
-        <w:rPr>
-          <w:sz w:val="28"/>
-          <w:szCs w:val="28"/>
-        </w:rPr>
-        <w:t>С:Документооборот</w:t>
-      </w:r>
-      <w:proofErr w:type="gramEnd"/>
-      <w:r>
-        <w:rPr>
-          <w:sz w:val="28"/>
-          <w:szCs w:val="28"/>
-        </w:rPr>
-        <w:t xml:space="preserve"> </w:t>
+        <w:t xml:space="preserve">1С:Документооборот </w:t>
       </w:r>
       <w:proofErr w:type="spellStart"/>
       <w:r>
@@ -21341,23 +21190,7 @@
           <w:sz w:val="28"/>
           <w:szCs w:val="28"/>
         </w:rPr>
-        <w:t>1</w:t>
-      </w:r>
-      <w:proofErr w:type="gramStart"/>
-      <w:r>
-        <w:rPr>
-          <w:sz w:val="28"/>
-          <w:szCs w:val="28"/>
-        </w:rPr>
-        <w:t>С:Документооборот</w:t>
-      </w:r>
-      <w:proofErr w:type="gramEnd"/>
-      <w:r>
-        <w:rPr>
-          <w:sz w:val="28"/>
-          <w:szCs w:val="28"/>
-        </w:rPr>
-        <w:t xml:space="preserve"> </w:t>
+        <w:t xml:space="preserve">1С:Документооборот </w:t>
       </w:r>
       <w:proofErr w:type="spellStart"/>
       <w:r>
@@ -22917,23 +22750,7 @@
           <w:sz w:val="28"/>
           <w:szCs w:val="28"/>
         </w:rPr>
-        <w:t>, 1</w:t>
-      </w:r>
-      <w:proofErr w:type="gramStart"/>
-      <w:r>
-        <w:rPr>
-          <w:sz w:val="28"/>
-          <w:szCs w:val="28"/>
-        </w:rPr>
-        <w:t>С:Документооборот</w:t>
-      </w:r>
-      <w:proofErr w:type="gramEnd"/>
-      <w:r>
-        <w:rPr>
-          <w:sz w:val="28"/>
-          <w:szCs w:val="28"/>
-        </w:rPr>
-        <w:t xml:space="preserve"> </w:t>
+        <w:t xml:space="preserve">, 1С:Документооборот </w:t>
       </w:r>
       <w:proofErr w:type="spellStart"/>
       <w:r>
@@ -24331,23 +24148,7 @@
           <w:sz w:val="28"/>
           <w:szCs w:val="28"/>
         </w:rPr>
-        <w:t>1</w:t>
-      </w:r>
-      <w:proofErr w:type="gramStart"/>
-      <w:r>
-        <w:rPr>
-          <w:sz w:val="28"/>
-          <w:szCs w:val="28"/>
-        </w:rPr>
-        <w:t>С:Документооборот</w:t>
-      </w:r>
-      <w:proofErr w:type="gramEnd"/>
-      <w:r>
-        <w:rPr>
-          <w:sz w:val="28"/>
-          <w:szCs w:val="28"/>
-        </w:rPr>
-        <w:t xml:space="preserve"> </w:t>
+        <w:t xml:space="preserve">1С:Документооборот </w:t>
       </w:r>
       <w:proofErr w:type="spellStart"/>
       <w:r>
@@ -25443,6 +25244,1153 @@
           <w:sz w:val="28"/>
           <w:szCs w:val="28"/>
           <w:lang w:val="kk-KZ"/>
+        </w:rPr>
+      </w:pPr>
+      <w:r>
+        <w:rPr>
+          <w:sz w:val="28"/>
+          <w:szCs w:val="28"/>
+          <w:lang w:val="kk-KZ"/>
+        </w:rPr>
+        <w:t>Төртіншіден, жүктеме көрсеткіштері қарастырылады. Бұл көрсеткіштер қызметкерлер арасындағы тапсырмалардың бөліну деңгейін анықтайды. Жүктеменің теңгерімсіз бөлінуі процестердің тиімділігіне теріс әсер етуі мүмкін, сондықтан бұл көрсеткіштерді бақылау маңызды.</w:t>
+      </w:r>
+    </w:p>
+    <w:p>
+      <w:pPr>
+        <w:widowControl/>
+        <w:autoSpaceDE/>
+        <w:autoSpaceDN/>
+        <w:ind w:firstLine="709"/>
+        <w:jc w:val="both"/>
+        <w:rPr>
+          <w:sz w:val="28"/>
+          <w:szCs w:val="28"/>
+          <w:lang w:val="kk-KZ"/>
+        </w:rPr>
+      </w:pPr>
+      <w:r>
+        <w:rPr>
+          <w:sz w:val="28"/>
+          <w:szCs w:val="28"/>
+          <w:lang w:val="kk-KZ"/>
+        </w:rPr>
+        <w:t>KPI көрсеткіштерін қалыптастыру кезінде олардың нақты, өлшенетін, қолжетімді, маңызды және уақытқа тәуелді болуы қажет. Бұл қағидалар SMART принципі ретінде белгілі. SMART талаптарына сәйкес келетін KPI көрсеткіштері басқару процесінде тиімді қолданылады.</w:t>
+      </w:r>
+    </w:p>
+    <w:p>
+      <w:pPr>
+        <w:widowControl/>
+        <w:autoSpaceDE/>
+        <w:autoSpaceDN/>
+        <w:ind w:firstLine="709"/>
+        <w:jc w:val="both"/>
+        <w:rPr>
+          <w:sz w:val="28"/>
+          <w:szCs w:val="28"/>
+          <w:lang w:val="kk-KZ"/>
+        </w:rPr>
+      </w:pPr>
+      <w:r>
+        <w:rPr>
+          <w:sz w:val="28"/>
+          <w:szCs w:val="28"/>
+          <w:lang w:val="kk-KZ"/>
+        </w:rPr>
+        <w:t>KPI көрсеткіштерін есептеу үшін нақты формулалар қолданылады. Мысалы:</w:t>
+      </w:r>
+    </w:p>
+    <w:p>
+      <w:pPr>
+        <w:widowControl/>
+        <w:autoSpaceDE/>
+        <w:autoSpaceDN/>
+        <w:ind w:firstLine="709"/>
+        <w:jc w:val="both"/>
+        <w:rPr>
+          <w:sz w:val="28"/>
+          <w:szCs w:val="28"/>
+          <w:lang w:val="kk-KZ"/>
+        </w:rPr>
+      </w:pPr>
+      <w:r>
+        <w:rPr>
+          <w:sz w:val="28"/>
+          <w:szCs w:val="28"/>
+          <w:lang w:val="kk-KZ"/>
+        </w:rPr>
+        <w:t>– тапсырманы уақытында орындау коэффициенті:</w:t>
+      </w:r>
+    </w:p>
+    <w:p>
+      <w:pPr>
+        <w:widowControl/>
+        <w:autoSpaceDE/>
+        <w:autoSpaceDN/>
+        <w:ind w:firstLine="709"/>
+        <w:jc w:val="both"/>
+        <w:rPr>
+          <w:sz w:val="28"/>
+          <w:szCs w:val="28"/>
+        </w:rPr>
+      </w:pPr>
+      <m:oMathPara>
+        <m:oMath>
+          <m:sSub>
+            <m:sSubPr>
+              <m:ctrlPr>
+                <w:rPr>
+                  <w:rFonts w:ascii="Cambria Math" w:hAnsi="Cambria Math"/>
+                  <w:sz w:val="28"/>
+                  <w:szCs w:val="28"/>
+                </w:rPr>
+              </m:ctrlPr>
+            </m:sSubPr>
+            <m:e>
+              <m:r>
+                <w:rPr>
+                  <w:rFonts w:ascii="Cambria Math" w:hAnsi="Cambria Math"/>
+                  <w:sz w:val="28"/>
+                  <w:szCs w:val="28"/>
+                </w:rPr>
+                <m:t>K</m:t>
+              </m:r>
+            </m:e>
+            <m:sub>
+              <m:r>
+                <w:rPr>
+                  <w:rFonts w:ascii="Cambria Math" w:hAnsi="Cambria Math"/>
+                  <w:sz w:val="28"/>
+                  <w:szCs w:val="28"/>
+                </w:rPr>
+                <m:t>time</m:t>
+              </m:r>
+            </m:sub>
+          </m:sSub>
+          <m:r>
+            <w:rPr>
+              <w:rFonts w:ascii="Cambria Math" w:hAnsi="Cambria Math"/>
+              <w:sz w:val="28"/>
+              <w:szCs w:val="28"/>
+            </w:rPr>
+            <m:t>=</m:t>
+          </m:r>
+          <m:f>
+            <m:fPr>
+              <m:ctrlPr>
+                <w:rPr>
+                  <w:rFonts w:ascii="Cambria Math" w:hAnsi="Cambria Math"/>
+                  <w:sz w:val="28"/>
+                  <w:szCs w:val="28"/>
+                </w:rPr>
+              </m:ctrlPr>
+            </m:fPr>
+            <m:num>
+              <m:sSub>
+                <m:sSubPr>
+                  <m:ctrlPr>
+                    <w:rPr>
+                      <w:rFonts w:ascii="Cambria Math" w:hAnsi="Cambria Math"/>
+                      <w:sz w:val="28"/>
+                      <w:szCs w:val="28"/>
+                    </w:rPr>
+                  </m:ctrlPr>
+                </m:sSubPr>
+                <m:e>
+                  <m:r>
+                    <w:rPr>
+                      <w:rFonts w:ascii="Cambria Math" w:hAnsi="Cambria Math"/>
+                      <w:sz w:val="28"/>
+                      <w:szCs w:val="28"/>
+                    </w:rPr>
+                    <m:t>N</m:t>
+                  </m:r>
+                </m:e>
+                <m:sub>
+                  <m:r>
+                    <w:rPr>
+                      <w:rFonts w:ascii="Cambria Math" w:hAnsi="Cambria Math"/>
+                      <w:sz w:val="28"/>
+                      <w:szCs w:val="28"/>
+                    </w:rPr>
+                    <m:t>on</m:t>
+                  </m:r>
+                  <m:r>
+                    <m:rPr>
+                      <m:sty m:val="p"/>
+                    </m:rPr>
+                    <w:rPr>
+                      <w:rFonts w:ascii="Cambria Math" w:hAnsi="Cambria Math"/>
+                      <w:sz w:val="28"/>
+                      <w:szCs w:val="28"/>
+                    </w:rPr>
+                    <m:t>_</m:t>
+                  </m:r>
+                  <m:r>
+                    <w:rPr>
+                      <w:rFonts w:ascii="Cambria Math" w:hAnsi="Cambria Math"/>
+                      <w:sz w:val="28"/>
+                      <w:szCs w:val="28"/>
+                    </w:rPr>
+                    <m:t>time</m:t>
+                  </m:r>
+                </m:sub>
+              </m:sSub>
+            </m:num>
+            <m:den>
+              <m:sSub>
+                <m:sSubPr>
+                  <m:ctrlPr>
+                    <w:rPr>
+                      <w:rFonts w:ascii="Cambria Math" w:hAnsi="Cambria Math"/>
+                      <w:sz w:val="28"/>
+                      <w:szCs w:val="28"/>
+                    </w:rPr>
+                  </m:ctrlPr>
+                </m:sSubPr>
+                <m:e>
+                  <m:r>
+                    <w:rPr>
+                      <w:rFonts w:ascii="Cambria Math" w:hAnsi="Cambria Math"/>
+                      <w:sz w:val="28"/>
+                      <w:szCs w:val="28"/>
+                    </w:rPr>
+                    <m:t>N</m:t>
+                  </m:r>
+                </m:e>
+                <m:sub>
+                  <m:r>
+                    <w:rPr>
+                      <w:rFonts w:ascii="Cambria Math" w:hAnsi="Cambria Math"/>
+                      <w:sz w:val="28"/>
+                      <w:szCs w:val="28"/>
+                    </w:rPr>
+                    <m:t>total</m:t>
+                  </m:r>
+                </m:sub>
+              </m:sSub>
+            </m:den>
+          </m:f>
+        </m:oMath>
+      </m:oMathPara>
+    </w:p>
+    <w:p>
+      <w:pPr>
+        <w:widowControl/>
+        <w:autoSpaceDE/>
+        <w:autoSpaceDN/>
+        <w:ind w:firstLine="709"/>
+        <w:jc w:val="both"/>
+        <w:rPr>
+          <w:sz w:val="28"/>
+          <w:szCs w:val="28"/>
+        </w:rPr>
+      </w:pPr>
+      <w:proofErr w:type="spellStart"/>
+      <w:r>
+        <w:rPr>
+          <w:sz w:val="28"/>
+          <w:szCs w:val="28"/>
+        </w:rPr>
+        <w:t>мұндағы</w:t>
+      </w:r>
+      <w:proofErr w:type="spellEnd"/>
+      <w:r>
+        <w:rPr>
+          <w:sz w:val="28"/>
+          <w:szCs w:val="28"/>
+        </w:rPr>
+        <w:t xml:space="preserve"> </w:t>
+      </w:r>
+      <m:oMath>
+        <m:sSub>
+          <m:sSubPr>
+            <m:ctrlPr>
+              <w:rPr>
+                <w:rFonts w:ascii="Cambria Math" w:hAnsi="Cambria Math"/>
+                <w:sz w:val="28"/>
+                <w:szCs w:val="28"/>
+              </w:rPr>
+            </m:ctrlPr>
+          </m:sSubPr>
+          <m:e>
+            <m:r>
+              <w:rPr>
+                <w:rFonts w:ascii="Cambria Math" w:hAnsi="Cambria Math"/>
+                <w:sz w:val="28"/>
+                <w:szCs w:val="28"/>
+              </w:rPr>
+              <m:t>N</m:t>
+            </m:r>
+          </m:e>
+          <m:sub>
+            <m:r>
+              <w:rPr>
+                <w:rFonts w:ascii="Cambria Math" w:hAnsi="Cambria Math"/>
+                <w:sz w:val="28"/>
+                <w:szCs w:val="28"/>
+              </w:rPr>
+              <m:t>on</m:t>
+            </m:r>
+            <m:r>
+              <m:rPr>
+                <m:sty m:val="p"/>
+              </m:rPr>
+              <w:rPr>
+                <w:rFonts w:ascii="Cambria Math" w:hAnsi="Cambria Math"/>
+                <w:sz w:val="28"/>
+                <w:szCs w:val="28"/>
+              </w:rPr>
+              <m:t>_</m:t>
+            </m:r>
+            <m:r>
+              <w:rPr>
+                <w:rFonts w:ascii="Cambria Math" w:hAnsi="Cambria Math"/>
+                <w:sz w:val="28"/>
+                <w:szCs w:val="28"/>
+              </w:rPr>
+              <m:t>time</m:t>
+            </m:r>
+          </m:sub>
+        </m:sSub>
+      </m:oMath>
+      <w:r>
+        <w:rPr>
+          <w:sz w:val="28"/>
+          <w:szCs w:val="28"/>
+        </w:rPr>
+        <w:t>– уақытында орындалған тапсырмалар саны,</w:t>
+      </w:r>
+      <w:r>
+        <w:rPr>
+          <w:sz w:val="28"/>
+          <w:szCs w:val="28"/>
+        </w:rPr>
+        <w:br/>
+      </w:r>
+      <m:oMath>
+        <m:sSub>
+          <m:sSubPr>
+            <m:ctrlPr>
+              <w:rPr>
+                <w:rFonts w:ascii="Cambria Math" w:hAnsi="Cambria Math"/>
+                <w:sz w:val="28"/>
+                <w:szCs w:val="28"/>
+              </w:rPr>
+            </m:ctrlPr>
+          </m:sSubPr>
+          <m:e>
+            <m:r>
+              <w:rPr>
+                <w:rFonts w:ascii="Cambria Math" w:hAnsi="Cambria Math"/>
+                <w:sz w:val="28"/>
+                <w:szCs w:val="28"/>
+              </w:rPr>
+              <m:t>N</m:t>
+            </m:r>
+          </m:e>
+          <m:sub>
+            <m:r>
+              <w:rPr>
+                <w:rFonts w:ascii="Cambria Math" w:hAnsi="Cambria Math"/>
+                <w:sz w:val="28"/>
+                <w:szCs w:val="28"/>
+              </w:rPr>
+              <m:t>total</m:t>
+            </m:r>
+          </m:sub>
+        </m:sSub>
+      </m:oMath>
+      <w:r>
+        <w:rPr>
+          <w:sz w:val="28"/>
+          <w:szCs w:val="28"/>
+        </w:rPr>
+        <w:t>– жалпы тапсырмалар саны.</w:t>
+      </w:r>
+    </w:p>
+    <w:p>
+      <w:pPr>
+        <w:widowControl/>
+        <w:autoSpaceDE/>
+        <w:autoSpaceDN/>
+        <w:ind w:firstLine="709"/>
+        <w:jc w:val="both"/>
+        <w:rPr>
+          <w:sz w:val="28"/>
+          <w:szCs w:val="28"/>
+        </w:rPr>
+      </w:pPr>
+      <w:r>
+        <w:rPr>
+          <w:sz w:val="28"/>
+          <w:szCs w:val="28"/>
+        </w:rPr>
+        <w:t xml:space="preserve">– </w:t>
+      </w:r>
+      <w:proofErr w:type="spellStart"/>
+      <w:r>
+        <w:rPr>
+          <w:sz w:val="28"/>
+          <w:szCs w:val="28"/>
+        </w:rPr>
+        <w:t>орташа</w:t>
+      </w:r>
+      <w:proofErr w:type="spellEnd"/>
+      <w:r>
+        <w:rPr>
+          <w:sz w:val="28"/>
+          <w:szCs w:val="28"/>
+        </w:rPr>
+        <w:t xml:space="preserve"> </w:t>
+      </w:r>
+      <w:proofErr w:type="spellStart"/>
+      <w:r>
+        <w:rPr>
+          <w:sz w:val="28"/>
+          <w:szCs w:val="28"/>
+        </w:rPr>
+        <w:t>орындау</w:t>
+      </w:r>
+      <w:proofErr w:type="spellEnd"/>
+      <w:r>
+        <w:rPr>
+          <w:sz w:val="28"/>
+          <w:szCs w:val="28"/>
+        </w:rPr>
+        <w:t xml:space="preserve"> </w:t>
+      </w:r>
+      <w:proofErr w:type="spellStart"/>
+      <w:r>
+        <w:rPr>
+          <w:sz w:val="28"/>
+          <w:szCs w:val="28"/>
+        </w:rPr>
+        <w:t>уақыты</w:t>
+      </w:r>
+      <w:proofErr w:type="spellEnd"/>
+      <w:r>
+        <w:rPr>
+          <w:sz w:val="28"/>
+          <w:szCs w:val="28"/>
+        </w:rPr>
+        <w:t>:</w:t>
+      </w:r>
+    </w:p>
+    <w:p>
+      <w:pPr>
+        <w:widowControl/>
+        <w:autoSpaceDE/>
+        <w:autoSpaceDN/>
+        <w:ind w:firstLine="709"/>
+        <w:jc w:val="both"/>
+        <w:rPr>
+          <w:sz w:val="28"/>
+          <w:szCs w:val="28"/>
+        </w:rPr>
+      </w:pPr>
+      <m:oMathPara>
+        <m:oMath>
+          <m:sSub>
+            <m:sSubPr>
+              <m:ctrlPr>
+                <w:rPr>
+                  <w:rFonts w:ascii="Cambria Math" w:hAnsi="Cambria Math"/>
+                  <w:sz w:val="28"/>
+                  <w:szCs w:val="28"/>
+                </w:rPr>
+              </m:ctrlPr>
+            </m:sSubPr>
+            <m:e>
+              <m:r>
+                <w:rPr>
+                  <w:rFonts w:ascii="Cambria Math" w:hAnsi="Cambria Math"/>
+                  <w:sz w:val="28"/>
+                  <w:szCs w:val="28"/>
+                </w:rPr>
+                <m:t>T</m:t>
+              </m:r>
+            </m:e>
+            <m:sub>
+              <m:r>
+                <w:rPr>
+                  <w:rFonts w:ascii="Cambria Math" w:hAnsi="Cambria Math"/>
+                  <w:sz w:val="28"/>
+                  <w:szCs w:val="28"/>
+                </w:rPr>
+                <m:t>avg</m:t>
+              </m:r>
+            </m:sub>
+          </m:sSub>
+          <m:r>
+            <w:rPr>
+              <w:rFonts w:ascii="Cambria Math" w:hAnsi="Cambria Math"/>
+              <w:sz w:val="28"/>
+              <w:szCs w:val="28"/>
+            </w:rPr>
+            <m:t>=</m:t>
+          </m:r>
+          <m:f>
+            <m:fPr>
+              <m:ctrlPr>
+                <w:rPr>
+                  <w:rFonts w:ascii="Cambria Math" w:hAnsi="Cambria Math"/>
+                  <w:sz w:val="28"/>
+                  <w:szCs w:val="28"/>
+                </w:rPr>
+              </m:ctrlPr>
+            </m:fPr>
+            <m:num>
+              <m:r>
+                <w:rPr>
+                  <w:rFonts w:ascii="Cambria Math" w:hAnsi="Cambria Math"/>
+                  <w:sz w:val="28"/>
+                  <w:szCs w:val="28"/>
+                </w:rPr>
+                <m:t>∑</m:t>
+              </m:r>
+              <m:sSub>
+                <m:sSubPr>
+                  <m:ctrlPr>
+                    <w:rPr>
+                      <w:rFonts w:ascii="Cambria Math" w:hAnsi="Cambria Math"/>
+                      <w:sz w:val="28"/>
+                      <w:szCs w:val="28"/>
+                    </w:rPr>
+                  </m:ctrlPr>
+                </m:sSubPr>
+                <m:e>
+                  <m:r>
+                    <w:rPr>
+                      <w:rFonts w:ascii="Cambria Math" w:hAnsi="Cambria Math"/>
+                      <w:sz w:val="28"/>
+                      <w:szCs w:val="28"/>
+                    </w:rPr>
+                    <m:t>T</m:t>
+                  </m:r>
+                </m:e>
+                <m:sub>
+                  <m:r>
+                    <w:rPr>
+                      <w:rFonts w:ascii="Cambria Math" w:hAnsi="Cambria Math"/>
+                      <w:sz w:val="28"/>
+                      <w:szCs w:val="28"/>
+                    </w:rPr>
+                    <m:t>i</m:t>
+                  </m:r>
+                </m:sub>
+              </m:sSub>
+            </m:num>
+            <m:den>
+              <m:r>
+                <w:rPr>
+                  <w:rFonts w:ascii="Cambria Math" w:hAnsi="Cambria Math"/>
+                  <w:sz w:val="28"/>
+                  <w:szCs w:val="28"/>
+                </w:rPr>
+                <m:t>N</m:t>
+              </m:r>
+            </m:den>
+          </m:f>
+        </m:oMath>
+      </m:oMathPara>
+    </w:p>
+    <w:p>
+      <w:pPr>
+        <w:widowControl/>
+        <w:autoSpaceDE/>
+        <w:autoSpaceDN/>
+        <w:ind w:firstLine="709"/>
+        <w:jc w:val="both"/>
+        <w:rPr>
+          <w:sz w:val="28"/>
+          <w:szCs w:val="28"/>
+        </w:rPr>
+      </w:pPr>
+      <w:proofErr w:type="spellStart"/>
+      <w:r>
+        <w:rPr>
+          <w:sz w:val="28"/>
+          <w:szCs w:val="28"/>
+        </w:rPr>
+        <w:t>мұндағы</w:t>
+      </w:r>
+      <w:proofErr w:type="spellEnd"/>
+      <w:r>
+        <w:rPr>
+          <w:sz w:val="28"/>
+          <w:szCs w:val="28"/>
+        </w:rPr>
+        <w:t xml:space="preserve"> </w:t>
+      </w:r>
+      <m:oMath>
+        <m:sSub>
+          <m:sSubPr>
+            <m:ctrlPr>
+              <w:rPr>
+                <w:rFonts w:ascii="Cambria Math" w:hAnsi="Cambria Math"/>
+                <w:sz w:val="28"/>
+                <w:szCs w:val="28"/>
+              </w:rPr>
+            </m:ctrlPr>
+          </m:sSubPr>
+          <m:e>
+            <m:r>
+              <w:rPr>
+                <w:rFonts w:ascii="Cambria Math" w:hAnsi="Cambria Math"/>
+                <w:sz w:val="28"/>
+                <w:szCs w:val="28"/>
+              </w:rPr>
+              <m:t>T</m:t>
+            </m:r>
+          </m:e>
+          <m:sub>
+            <m:r>
+              <w:rPr>
+                <w:rFonts w:ascii="Cambria Math" w:hAnsi="Cambria Math"/>
+                <w:sz w:val="28"/>
+                <w:szCs w:val="28"/>
+              </w:rPr>
+              <m:t>i</m:t>
+            </m:r>
+          </m:sub>
+        </m:sSub>
+      </m:oMath>
+      <w:r>
+        <w:rPr>
+          <w:sz w:val="28"/>
+          <w:szCs w:val="28"/>
+        </w:rPr>
+        <w:t>– әрбір тапсырманың орындалу уақыты,</w:t>
+      </w:r>
+      <w:r>
+        <w:rPr>
+          <w:sz w:val="28"/>
+          <w:szCs w:val="28"/>
+        </w:rPr>
+        <w:br/>
+      </w:r>
+      <m:oMath>
+        <m:r>
+          <w:rPr>
+            <w:rFonts w:ascii="Cambria Math" w:hAnsi="Cambria Math"/>
+            <w:sz w:val="28"/>
+            <w:szCs w:val="28"/>
+          </w:rPr>
+          <m:t>N</m:t>
+        </m:r>
+      </m:oMath>
+      <w:r>
+        <w:rPr>
+          <w:sz w:val="28"/>
+          <w:szCs w:val="28"/>
+        </w:rPr>
+        <w:t>– тапсырмалар саны.</w:t>
+      </w:r>
+    </w:p>
+    <w:p>
+      <w:pPr>
+        <w:widowControl/>
+        <w:autoSpaceDE/>
+        <w:autoSpaceDN/>
+        <w:ind w:firstLine="709"/>
+        <w:jc w:val="both"/>
+        <w:rPr>
+          <w:sz w:val="28"/>
+          <w:szCs w:val="28"/>
+        </w:rPr>
+      </w:pPr>
+      <w:r>
+        <w:rPr>
+          <w:sz w:val="28"/>
+          <w:szCs w:val="28"/>
+        </w:rPr>
+        <w:t xml:space="preserve">– </w:t>
+      </w:r>
+      <w:proofErr w:type="spellStart"/>
+      <w:r>
+        <w:rPr>
+          <w:sz w:val="28"/>
+          <w:szCs w:val="28"/>
+        </w:rPr>
+        <w:t>өнімділік</w:t>
+      </w:r>
+      <w:proofErr w:type="spellEnd"/>
+      <w:r>
+        <w:rPr>
+          <w:sz w:val="28"/>
+          <w:szCs w:val="28"/>
+        </w:rPr>
+        <w:t xml:space="preserve"> </w:t>
+      </w:r>
+      <w:proofErr w:type="spellStart"/>
+      <w:r>
+        <w:rPr>
+          <w:sz w:val="28"/>
+          <w:szCs w:val="28"/>
+        </w:rPr>
+        <w:t>көрсеткіші</w:t>
+      </w:r>
+      <w:proofErr w:type="spellEnd"/>
+      <w:r>
+        <w:rPr>
+          <w:sz w:val="28"/>
+          <w:szCs w:val="28"/>
+        </w:rPr>
+        <w:t>:</w:t>
+      </w:r>
+    </w:p>
+    <w:p>
+      <w:pPr>
+        <w:widowControl/>
+        <w:autoSpaceDE/>
+        <w:autoSpaceDN/>
+        <w:ind w:firstLine="709"/>
+        <w:jc w:val="both"/>
+        <w:rPr>
+          <w:sz w:val="28"/>
+          <w:szCs w:val="28"/>
+        </w:rPr>
+      </w:pPr>
+      <m:oMathPara>
+        <m:oMath>
+          <m:r>
+            <w:rPr>
+              <w:rFonts w:ascii="Cambria Math" w:hAnsi="Cambria Math"/>
+              <w:sz w:val="28"/>
+              <w:szCs w:val="28"/>
+            </w:rPr>
+            <m:t>P=</m:t>
+          </m:r>
+          <m:f>
+            <m:fPr>
+              <m:ctrlPr>
+                <w:rPr>
+                  <w:rFonts w:ascii="Cambria Math" w:hAnsi="Cambria Math"/>
+                  <w:sz w:val="28"/>
+                  <w:szCs w:val="28"/>
+                </w:rPr>
+              </m:ctrlPr>
+            </m:fPr>
+            <m:num>
+              <m:sSub>
+                <m:sSubPr>
+                  <m:ctrlPr>
+                    <w:rPr>
+                      <w:rFonts w:ascii="Cambria Math" w:hAnsi="Cambria Math"/>
+                      <w:sz w:val="28"/>
+                      <w:szCs w:val="28"/>
+                    </w:rPr>
+                  </m:ctrlPr>
+                </m:sSubPr>
+                <m:e>
+                  <m:r>
+                    <w:rPr>
+                      <w:rFonts w:ascii="Cambria Math" w:hAnsi="Cambria Math"/>
+                      <w:sz w:val="28"/>
+                      <w:szCs w:val="28"/>
+                    </w:rPr>
+                    <m:t>N</m:t>
+                  </m:r>
+                </m:e>
+                <m:sub>
+                  <m:r>
+                    <w:rPr>
+                      <w:rFonts w:ascii="Cambria Math" w:hAnsi="Cambria Math"/>
+                      <w:sz w:val="28"/>
+                      <w:szCs w:val="28"/>
+                    </w:rPr>
+                    <m:t>tasks</m:t>
+                  </m:r>
+                </m:sub>
+              </m:sSub>
+            </m:num>
+            <m:den>
+              <m:r>
+                <w:rPr>
+                  <w:rFonts w:ascii="Cambria Math" w:hAnsi="Cambria Math"/>
+                  <w:sz w:val="28"/>
+                  <w:szCs w:val="28"/>
+                </w:rPr>
+                <m:t>T</m:t>
+              </m:r>
+            </m:den>
+          </m:f>
+        </m:oMath>
+      </m:oMathPara>
+    </w:p>
+    <w:p>
+      <w:pPr>
+        <w:widowControl/>
+        <w:autoSpaceDE/>
+        <w:autoSpaceDN/>
+        <w:ind w:firstLine="709"/>
+        <w:jc w:val="both"/>
+        <w:rPr>
+          <w:sz w:val="28"/>
+          <w:szCs w:val="28"/>
+        </w:rPr>
+      </w:pPr>
+      <w:proofErr w:type="spellStart"/>
+      <w:r>
+        <w:rPr>
+          <w:sz w:val="28"/>
+          <w:szCs w:val="28"/>
+        </w:rPr>
+        <w:t>мұндағы</w:t>
+      </w:r>
+      <w:proofErr w:type="spellEnd"/>
+      <w:r>
+        <w:rPr>
+          <w:sz w:val="28"/>
+          <w:szCs w:val="28"/>
+        </w:rPr>
+        <w:t xml:space="preserve"> </w:t>
+      </w:r>
+      <m:oMath>
+        <m:sSub>
+          <m:sSubPr>
+            <m:ctrlPr>
+              <w:rPr>
+                <w:rFonts w:ascii="Cambria Math" w:hAnsi="Cambria Math"/>
+                <w:sz w:val="28"/>
+                <w:szCs w:val="28"/>
+              </w:rPr>
+            </m:ctrlPr>
+          </m:sSubPr>
+          <m:e>
+            <m:r>
+              <w:rPr>
+                <w:rFonts w:ascii="Cambria Math" w:hAnsi="Cambria Math"/>
+                <w:sz w:val="28"/>
+                <w:szCs w:val="28"/>
+              </w:rPr>
+              <m:t>N</m:t>
+            </m:r>
+          </m:e>
+          <m:sub>
+            <m:r>
+              <w:rPr>
+                <w:rFonts w:ascii="Cambria Math" w:hAnsi="Cambria Math"/>
+                <w:sz w:val="28"/>
+                <w:szCs w:val="28"/>
+              </w:rPr>
+              <m:t>tasks</m:t>
+            </m:r>
+          </m:sub>
+        </m:sSub>
+      </m:oMath>
+      <w:r>
+        <w:rPr>
+          <w:sz w:val="28"/>
+          <w:szCs w:val="28"/>
+        </w:rPr>
+        <w:t>– орындалған тапсырмалар саны,</w:t>
+      </w:r>
+      <w:r>
+        <w:rPr>
+          <w:sz w:val="28"/>
+          <w:szCs w:val="28"/>
+        </w:rPr>
+        <w:br/>
+      </w:r>
+      <m:oMath>
+        <m:r>
+          <w:rPr>
+            <w:rFonts w:ascii="Cambria Math" w:hAnsi="Cambria Math"/>
+            <w:sz w:val="28"/>
+            <w:szCs w:val="28"/>
+          </w:rPr>
+          <m:t>T</m:t>
+        </m:r>
+      </m:oMath>
+      <w:r>
+        <w:rPr>
+          <w:sz w:val="28"/>
+          <w:szCs w:val="28"/>
+        </w:rPr>
+        <w:t>– уақыт аралығы.</w:t>
+      </w:r>
+    </w:p>
+    <w:p>
+      <w:pPr>
+        <w:widowControl/>
+        <w:autoSpaceDE/>
+        <w:autoSpaceDN/>
+        <w:ind w:firstLine="709"/>
+        <w:jc w:val="both"/>
+        <w:rPr>
+          <w:sz w:val="28"/>
+          <w:szCs w:val="28"/>
+        </w:rPr>
+      </w:pPr>
+      <w:proofErr w:type="spellStart"/>
+      <w:r>
+        <w:rPr>
+          <w:sz w:val="28"/>
+          <w:szCs w:val="28"/>
+        </w:rPr>
+        <w:lastRenderedPageBreak/>
+        <w:t>Бұл</w:t>
+      </w:r>
+      <w:proofErr w:type="spellEnd"/>
+      <w:r>
+        <w:rPr>
+          <w:sz w:val="28"/>
+          <w:szCs w:val="28"/>
+        </w:rPr>
+        <w:t xml:space="preserve"> </w:t>
+      </w:r>
+      <w:proofErr w:type="spellStart"/>
+      <w:r>
+        <w:rPr>
+          <w:sz w:val="28"/>
+          <w:szCs w:val="28"/>
+        </w:rPr>
+        <w:t>көрсеткіштер</w:t>
+      </w:r>
+      <w:proofErr w:type="spellEnd"/>
+      <w:r>
+        <w:rPr>
+          <w:sz w:val="28"/>
+          <w:szCs w:val="28"/>
+        </w:rPr>
+        <w:t xml:space="preserve"> </w:t>
+      </w:r>
+      <w:proofErr w:type="spellStart"/>
+      <w:r>
+        <w:rPr>
+          <w:sz w:val="28"/>
+          <w:szCs w:val="28"/>
+        </w:rPr>
+        <w:t>процестердің</w:t>
+      </w:r>
+      <w:proofErr w:type="spellEnd"/>
+      <w:r>
+        <w:rPr>
+          <w:sz w:val="28"/>
+          <w:szCs w:val="28"/>
+        </w:rPr>
+        <w:t xml:space="preserve"> </w:t>
+      </w:r>
+      <w:proofErr w:type="spellStart"/>
+      <w:r>
+        <w:rPr>
+          <w:sz w:val="28"/>
+          <w:szCs w:val="28"/>
+        </w:rPr>
+        <w:t>тиімділігін</w:t>
+      </w:r>
+      <w:proofErr w:type="spellEnd"/>
+      <w:r>
+        <w:rPr>
+          <w:sz w:val="28"/>
+          <w:szCs w:val="28"/>
+        </w:rPr>
+        <w:t xml:space="preserve"> </w:t>
+      </w:r>
+      <w:proofErr w:type="spellStart"/>
+      <w:r>
+        <w:rPr>
+          <w:sz w:val="28"/>
+          <w:szCs w:val="28"/>
+        </w:rPr>
+        <w:t>сандық</w:t>
+      </w:r>
+      <w:proofErr w:type="spellEnd"/>
+      <w:r>
+        <w:rPr>
+          <w:sz w:val="28"/>
+          <w:szCs w:val="28"/>
+        </w:rPr>
+        <w:t xml:space="preserve"> </w:t>
+      </w:r>
+      <w:proofErr w:type="spellStart"/>
+      <w:r>
+        <w:rPr>
+          <w:sz w:val="28"/>
+          <w:szCs w:val="28"/>
+        </w:rPr>
+        <w:t>түрде</w:t>
+      </w:r>
+      <w:proofErr w:type="spellEnd"/>
+      <w:r>
+        <w:rPr>
+          <w:sz w:val="28"/>
+          <w:szCs w:val="28"/>
+        </w:rPr>
+        <w:t xml:space="preserve"> </w:t>
+      </w:r>
+      <w:proofErr w:type="spellStart"/>
+      <w:r>
+        <w:rPr>
+          <w:sz w:val="28"/>
+          <w:szCs w:val="28"/>
+        </w:rPr>
+        <w:t>бағалауға</w:t>
+      </w:r>
+      <w:proofErr w:type="spellEnd"/>
+      <w:r>
+        <w:rPr>
+          <w:sz w:val="28"/>
+          <w:szCs w:val="28"/>
+        </w:rPr>
+        <w:t xml:space="preserve"> </w:t>
+      </w:r>
+      <w:proofErr w:type="spellStart"/>
+      <w:r>
+        <w:rPr>
+          <w:sz w:val="28"/>
+          <w:szCs w:val="28"/>
+        </w:rPr>
+        <w:t>мүмкіндік</w:t>
+      </w:r>
+      <w:proofErr w:type="spellEnd"/>
+      <w:r>
+        <w:rPr>
+          <w:sz w:val="28"/>
+          <w:szCs w:val="28"/>
+        </w:rPr>
+        <w:t xml:space="preserve"> </w:t>
+      </w:r>
+      <w:proofErr w:type="spellStart"/>
+      <w:r>
+        <w:rPr>
+          <w:sz w:val="28"/>
+          <w:szCs w:val="28"/>
+        </w:rPr>
+        <w:t>береді</w:t>
+      </w:r>
+      <w:proofErr w:type="spellEnd"/>
+      <w:r>
+        <w:rPr>
+          <w:sz w:val="28"/>
+          <w:szCs w:val="28"/>
+        </w:rPr>
+        <w:t xml:space="preserve"> </w:t>
+      </w:r>
+      <w:proofErr w:type="spellStart"/>
+      <w:r>
+        <w:rPr>
+          <w:sz w:val="28"/>
+          <w:szCs w:val="28"/>
+        </w:rPr>
+        <w:t>және</w:t>
+      </w:r>
+      <w:proofErr w:type="spellEnd"/>
+      <w:r>
+        <w:rPr>
+          <w:sz w:val="28"/>
+          <w:szCs w:val="28"/>
+        </w:rPr>
+        <w:t xml:space="preserve"> </w:t>
+      </w:r>
+      <w:proofErr w:type="spellStart"/>
+      <w:r>
+        <w:rPr>
+          <w:sz w:val="28"/>
+          <w:szCs w:val="28"/>
+        </w:rPr>
+        <w:t>басқарушылық</w:t>
+      </w:r>
+      <w:proofErr w:type="spellEnd"/>
+      <w:r>
+        <w:rPr>
+          <w:sz w:val="28"/>
+          <w:szCs w:val="28"/>
+        </w:rPr>
+        <w:t xml:space="preserve"> </w:t>
+      </w:r>
+      <w:proofErr w:type="spellStart"/>
+      <w:r>
+        <w:rPr>
+          <w:sz w:val="28"/>
+          <w:szCs w:val="28"/>
+        </w:rPr>
+        <w:t>талдау</w:t>
+      </w:r>
+      <w:proofErr w:type="spellEnd"/>
+      <w:r>
+        <w:rPr>
+          <w:sz w:val="28"/>
+          <w:szCs w:val="28"/>
+        </w:rPr>
+        <w:t xml:space="preserve"> </w:t>
+      </w:r>
+      <w:proofErr w:type="spellStart"/>
+      <w:r>
+        <w:rPr>
+          <w:sz w:val="28"/>
+          <w:szCs w:val="28"/>
+        </w:rPr>
+        <w:t>жүргізу</w:t>
+      </w:r>
+      <w:proofErr w:type="spellEnd"/>
+      <w:r>
+        <w:rPr>
+          <w:sz w:val="28"/>
+          <w:szCs w:val="28"/>
+        </w:rPr>
+        <w:t xml:space="preserve"> </w:t>
+      </w:r>
+      <w:proofErr w:type="spellStart"/>
+      <w:r>
+        <w:rPr>
+          <w:sz w:val="28"/>
+          <w:szCs w:val="28"/>
+        </w:rPr>
+        <w:t>үшін</w:t>
+      </w:r>
+      <w:proofErr w:type="spellEnd"/>
+      <w:r>
+        <w:rPr>
+          <w:sz w:val="28"/>
+          <w:szCs w:val="28"/>
+        </w:rPr>
+        <w:t xml:space="preserve"> </w:t>
+      </w:r>
+      <w:proofErr w:type="spellStart"/>
+      <w:r>
+        <w:rPr>
+          <w:sz w:val="28"/>
+          <w:szCs w:val="28"/>
+        </w:rPr>
+        <w:t>негіз</w:t>
+      </w:r>
+      <w:proofErr w:type="spellEnd"/>
+      <w:r>
+        <w:rPr>
+          <w:sz w:val="28"/>
+          <w:szCs w:val="28"/>
+        </w:rPr>
+        <w:t xml:space="preserve"> </w:t>
+      </w:r>
+      <w:proofErr w:type="spellStart"/>
+      <w:r>
+        <w:rPr>
+          <w:sz w:val="28"/>
+          <w:szCs w:val="28"/>
+        </w:rPr>
+        <w:t>болады</w:t>
+      </w:r>
+      <w:proofErr w:type="spellEnd"/>
+      <w:r>
+        <w:rPr>
+          <w:sz w:val="28"/>
+          <w:szCs w:val="28"/>
+        </w:rPr>
+        <w:t>.</w:t>
+      </w:r>
+    </w:p>
+    <w:p>
+      <w:pPr>
+        <w:widowControl/>
+        <w:autoSpaceDE/>
+        <w:autoSpaceDN/>
+        <w:ind w:firstLine="709"/>
+        <w:jc w:val="both"/>
+        <w:rPr>
+          <w:sz w:val="28"/>
+          <w:szCs w:val="28"/>
         </w:rPr>
       </w:pPr>
     </w:p>
@@ -27084,7 +28032,6 @@
                 <w:lang w:val="kk-KZ"/>
               </w:rPr>
             </w:pPr>
-            <w:proofErr w:type="gramStart"/>
             <w:r>
               <w:rPr>
                 <w:sz w:val="28"/>
@@ -27098,16 +28045,7 @@
                 <w:szCs w:val="28"/>
                 <w:lang w:val="kk-KZ"/>
               </w:rPr>
-              <w:t>(</w:t>
-            </w:r>
-            <w:proofErr w:type="gramEnd"/>
-            <w:r>
-              <w:rPr>
-                <w:sz w:val="28"/>
-                <w:szCs w:val="28"/>
-                <w:lang w:val="kk-KZ"/>
-              </w:rPr>
-              <w:t>Жабылу күні – Тіркеу күні) / Құжат саны</w:t>
+              <w:t>(Жабылу күні – Тіркеу күні) / Құжат саны</w:t>
             </w:r>
           </w:p>
         </w:tc>
@@ -27939,7 +28877,6 @@
                 <w:lang w:val="kk-KZ"/>
               </w:rPr>
             </w:pPr>
-            <w:proofErr w:type="gramStart"/>
             <w:r>
               <w:rPr>
                 <w:sz w:val="28"/>
@@ -27953,16 +28890,7 @@
                 <w:szCs w:val="28"/>
                 <w:lang w:val="kk-KZ"/>
               </w:rPr>
-              <w:t>(</w:t>
-            </w:r>
-            <w:proofErr w:type="gramEnd"/>
-            <w:r>
-              <w:rPr>
-                <w:sz w:val="28"/>
-                <w:szCs w:val="28"/>
-                <w:lang w:val="kk-KZ"/>
-              </w:rPr>
-              <w:t>Келісу аяқталу күні – Келісу басталу күні) / Құжат саны</w:t>
+              <w:t>(Келісу аяқталу күні – Келісу басталу күні) / Құжат саны</w:t>
             </w:r>
           </w:p>
         </w:tc>
@@ -30999,23 +31927,7 @@
           <w:sz w:val="28"/>
           <w:szCs w:val="28"/>
         </w:rPr>
-        <w:t xml:space="preserve"> 1</w:t>
-      </w:r>
-      <w:proofErr w:type="gramStart"/>
-      <w:r>
-        <w:rPr>
-          <w:sz w:val="28"/>
-          <w:szCs w:val="28"/>
-        </w:rPr>
-        <w:t>С:Документооборот</w:t>
-      </w:r>
-      <w:proofErr w:type="gramEnd"/>
-      <w:r>
-        <w:rPr>
-          <w:sz w:val="28"/>
-          <w:szCs w:val="28"/>
-        </w:rPr>
-        <w:t xml:space="preserve"> </w:t>
+        <w:t xml:space="preserve"> 1С:Документооборот </w:t>
       </w:r>
       <w:proofErr w:type="spellStart"/>
       <w:r>
@@ -39631,25 +40543,7 @@
           <w:szCs w:val="28"/>
           <w:lang w:val="en-US"/>
         </w:rPr>
-        <w:t xml:space="preserve">., </w:t>
-      </w:r>
-      <w:proofErr w:type="gramStart"/>
-      <w:r>
-        <w:rPr>
-          <w:sz w:val="28"/>
-          <w:szCs w:val="28"/>
-          <w:lang w:val="en-US"/>
-        </w:rPr>
-        <w:t>2022) —</w:t>
-      </w:r>
-      <w:proofErr w:type="gramEnd"/>
-      <w:r>
-        <w:rPr>
-          <w:sz w:val="28"/>
-          <w:szCs w:val="28"/>
-          <w:lang w:val="en-US"/>
-        </w:rPr>
-        <w:t xml:space="preserve"> Morgan Kaufmann</w:t>
+        <w:t>., 2022) — Morgan Kaufmann</w:t>
       </w:r>
       <w:r>
         <w:rPr>
@@ -39709,25 +40603,7 @@
           <w:szCs w:val="28"/>
           <w:lang w:val="en-US"/>
         </w:rPr>
-        <w:t xml:space="preserve">, </w:t>
-      </w:r>
-      <w:proofErr w:type="gramStart"/>
-      <w:r>
-        <w:rPr>
-          <w:sz w:val="28"/>
-          <w:szCs w:val="28"/>
-          <w:lang w:val="en-US"/>
-        </w:rPr>
-        <w:t>2021) —</w:t>
-      </w:r>
-      <w:proofErr w:type="gramEnd"/>
-      <w:r>
-        <w:rPr>
-          <w:sz w:val="28"/>
-          <w:szCs w:val="28"/>
-          <w:lang w:val="en-US"/>
-        </w:rPr>
-        <w:t xml:space="preserve"> Wiley</w:t>
+        <w:t>, 2021) — Wiley</w:t>
       </w:r>
       <w:r>
         <w:rPr>

</xml_diff>